<commit_message>
word table lines minimized
</commit_message>
<xml_diff>
--- a/flashcard.docx
+++ b/flashcard.docx
@@ -8,12 +8,12 @@
         <w:tblLayout w:type="fixed"/>
         <w:tblLook w:firstColumn="1" w:firstRow="1" w:lastColumn="0" w:lastRow="0" w:noHBand="0" w:noVBand="1" w:val="04A0"/>
         <w:tblBorders>
-          <w:top w:val="single" w:sz="8" w:space="0"/>
-          <w:left w:val="single" w:sz="8" w:space="0"/>
-          <w:bottom w:val="single" w:sz="8" w:space="0"/>
-          <w:right w:val="single" w:sz="8" w:space="0"/>
-          <w:insideH w:val="single" w:sz="8" w:space="0"/>
-          <w:insideV w:val="single" w:sz="8" w:space="0"/>
+          <w:top w:val="dotted" w:sz="2" w:space="0" w:color="D9D9D9"/>
+          <w:left w:val="dotted" w:sz="2" w:space="0" w:color="D9D9D9"/>
+          <w:bottom w:val="dotted" w:sz="2" w:space="0" w:color="D9D9D9"/>
+          <w:right w:val="dotted" w:sz="2" w:space="0" w:color="D9D9D9"/>
+          <w:insideH w:val="dotted" w:sz="2" w:space="0" w:color="D9D9D9"/>
+          <w:insideV w:val="dotted" w:sz="2" w:space="0" w:color="D9D9D9"/>
         </w:tblBorders>
       </w:tblPr>
       <w:tblGrid>
@@ -46,7 +46,7 @@
                 <w:b/>
                 <w:sz w:val="56"/>
               </w:rPr>
-              <w:t>einsteigen</w:t>
+              <w:t>anstoßen</w:t>
             </w:r>
           </w:p>
         </w:tc>
@@ -72,7 +72,7 @@
                 <w:b/>
                 <w:sz w:val="56"/>
               </w:rPr>
-              <w:t>aussteigen</w:t>
+              <w:t>gesprächig</w:t>
             </w:r>
           </w:p>
         </w:tc>
@@ -103,7 +103,7 @@
                 <w:b/>
                 <w:sz w:val="56"/>
               </w:rPr>
-              <w:t>aufmachen</w:t>
+              <w:t>Kicker</w:t>
             </w:r>
           </w:p>
         </w:tc>
@@ -129,7 +129,7 @@
                 <w:b/>
                 <w:sz w:val="56"/>
               </w:rPr>
-              <w:t>reinkommen</w:t>
+              <w:t>vertrauen</w:t>
             </w:r>
           </w:p>
         </w:tc>
@@ -160,7 +160,7 @@
                 <w:b/>
                 <w:sz w:val="56"/>
               </w:rPr>
-              <w:t>anfangen</w:t>
+              <w:t>sinnlos</w:t>
             </w:r>
           </w:p>
         </w:tc>
@@ -186,7 +186,7 @@
                 <w:b/>
                 <w:sz w:val="56"/>
               </w:rPr>
-              <w:t>vorbereiten</w:t>
+              <w:t>verändern</w:t>
             </w:r>
           </w:p>
         </w:tc>
@@ -217,35 +217,15 @@
                 <w:b/>
                 <w:sz w:val="56"/>
               </w:rPr>
-              <w:t>abwaschen</w:t>
+              <w:t>Gesetz</w:t>
             </w:r>
           </w:p>
         </w:tc>
         <w:tc>
           <w:tcPr>
             <w:tcW w:type="dxa" w:w="5947"/>
-            <w:vAlign w:val="center"/>
-            <w:tcMar>
-              <w:top w:w="0" w:type="dxa"/>
-              <w:left w:w="0" w:type="dxa"/>
-              <w:bottom w:w="0" w:type="dxa"/>
-              <w:right w:w="0" w:type="dxa"/>
-            </w:tcMar>
           </w:tcPr>
-          <w:p>
-            <w:pPr>
-              <w:spacing w:before="0" w:after="0" w:line="240" w:lineRule="auto"/>
-              <w:jc w:val="center"/>
-            </w:pPr>
-            <w:r>
-              <w:rPr>
-                <w:rFonts w:ascii="Candara" w:hAnsi="Candara"/>
-                <w:b/>
-                <w:sz w:val="56"/>
-              </w:rPr>
-              <w:t>anmachen</w:t>
-            </w:r>
-          </w:p>
+          <w:p/>
         </w:tc>
       </w:tr>
     </w:tbl>
@@ -255,12 +235,12 @@
         <w:tblLayout w:type="fixed"/>
         <w:tblLook w:firstColumn="1" w:firstRow="1" w:lastColumn="0" w:lastRow="0" w:noHBand="0" w:noVBand="1" w:val="04A0"/>
         <w:tblBorders>
-          <w:top w:val="single" w:sz="8" w:space="0"/>
-          <w:left w:val="single" w:sz="8" w:space="0"/>
-          <w:bottom w:val="single" w:sz="8" w:space="0"/>
-          <w:right w:val="single" w:sz="8" w:space="0"/>
-          <w:insideH w:val="single" w:sz="8" w:space="0"/>
-          <w:insideV w:val="single" w:sz="8" w:space="0"/>
+          <w:top w:val="nil"/>
+          <w:left w:val="nil"/>
+          <w:bottom w:val="nil"/>
+          <w:right w:val="nil"/>
+          <w:insideH w:val="nil"/>
+          <w:insideV w:val="nil"/>
         </w:tblBorders>
       </w:tblPr>
       <w:tblGrid>
@@ -292,7 +272,7 @@
                 <w:rFonts w:ascii="Candara" w:hAnsi="Candara"/>
                 <w:sz w:val="28"/>
               </w:rPr>
-              <w:t>to get out, to get off (a vehicle)</w:t>
+              <w:t>talkative, chatty</w:t>
               <w:br/>
             </w:r>
             <w:r>
@@ -300,7 +280,7 @@
                 <w:rFonts w:ascii="Candara" w:hAnsi="Candara"/>
                 <w:sz w:val="28"/>
               </w:rPr>
-              <w:t>Ich steige an der nächsten Haltestelle aus.</w:t>
+              <w:t>Er ist sehr gesprächig.</w:t>
               <w:br/>
             </w:r>
             <w:r>
@@ -308,7 +288,7 @@
                 <w:rFonts w:ascii="Candara" w:hAnsi="Candara"/>
                 <w:sz w:val="28"/>
               </w:rPr>
-              <w:t>Выходить, выходить из транспорта</w:t>
+              <w:t>Разговорчивый, общительный</w:t>
             </w:r>
           </w:p>
         </w:tc>
@@ -333,7 +313,7 @@
                 <w:rFonts w:ascii="Candara" w:hAnsi="Candara"/>
                 <w:sz w:val="28"/>
               </w:rPr>
-              <w:t>to get in, to board (a vehicle)</w:t>
+              <w:t>to toast, to clink glasses; to bump into something</w:t>
               <w:br/>
             </w:r>
             <w:r>
@@ -341,7 +321,7 @@
                 <w:rFonts w:ascii="Candara" w:hAnsi="Candara"/>
                 <w:sz w:val="28"/>
               </w:rPr>
-              <w:t>Ich steige in den Bus ein.</w:t>
+              <w:t>Wir stoßen auf deinen Erfolg an.</w:t>
               <w:br/>
             </w:r>
             <w:r>
@@ -349,7 +329,7 @@
                 <w:rFonts w:ascii="Candara" w:hAnsi="Candara"/>
                 <w:sz w:val="28"/>
               </w:rPr>
-              <w:t>Садиться, входить (в транспорт)</w:t>
+              <w:t>Чокаться, выпивать за кого-либо; ударяться обо что-либо</w:t>
             </w:r>
           </w:p>
         </w:tc>
@@ -379,7 +359,7 @@
                 <w:rFonts w:ascii="Candara" w:hAnsi="Candara"/>
                 <w:sz w:val="28"/>
               </w:rPr>
-              <w:t>to come in, to enter</w:t>
+              <w:t>to trust</w:t>
               <w:br/>
             </w:r>
             <w:r>
@@ -387,7 +367,7 @@
                 <w:rFonts w:ascii="Candara" w:hAnsi="Candara"/>
                 <w:sz w:val="28"/>
               </w:rPr>
-              <w:t>Komm bitte rein!</w:t>
+              <w:t>Ich vertraue dir.</w:t>
               <w:br/>
             </w:r>
             <w:r>
@@ -395,7 +375,7 @@
                 <w:rFonts w:ascii="Candara" w:hAnsi="Candara"/>
                 <w:sz w:val="28"/>
               </w:rPr>
-              <w:t>Входить, заходить</w:t>
+              <w:t>Доверять</w:t>
             </w:r>
           </w:p>
         </w:tc>
@@ -420,7 +400,7 @@
                 <w:rFonts w:ascii="Candara" w:hAnsi="Candara"/>
                 <w:sz w:val="28"/>
               </w:rPr>
-              <w:t>to open</w:t>
+              <w:t>M (der Kicker) – table football (foosball); football player (informal)</w:t>
               <w:br/>
             </w:r>
             <w:r>
@@ -428,7 +408,7 @@
                 <w:rFonts w:ascii="Candara" w:hAnsi="Candara"/>
                 <w:sz w:val="28"/>
               </w:rPr>
-              <w:t>Mach bitte das Fenster auf.</w:t>
+              <w:t>Wir spielen Kicker nach dem Unterricht.</w:t>
               <w:br/>
             </w:r>
             <w:r>
@@ -436,7 +416,7 @@
                 <w:rFonts w:ascii="Candara" w:hAnsi="Candara"/>
                 <w:sz w:val="28"/>
               </w:rPr>
-              <w:t>Открывать</w:t>
+              <w:t>Настольный футбол; футболист</w:t>
             </w:r>
           </w:p>
         </w:tc>
@@ -466,7 +446,7 @@
                 <w:rFonts w:ascii="Candara" w:hAnsi="Candara"/>
                 <w:sz w:val="28"/>
               </w:rPr>
-              <w:t>to prepare</w:t>
+              <w:t>to change, to alter, to modify</w:t>
               <w:br/>
             </w:r>
             <w:r>
@@ -474,7 +454,7 @@
                 <w:rFonts w:ascii="Candara" w:hAnsi="Candara"/>
                 <w:sz w:val="28"/>
               </w:rPr>
-              <w:t>Ich bereite das Essen vor.</w:t>
+              <w:t>Wir müssen unsere Pläne verändern.</w:t>
               <w:br/>
             </w:r>
             <w:r>
@@ -482,7 +462,7 @@
                 <w:rFonts w:ascii="Candara" w:hAnsi="Candara"/>
                 <w:sz w:val="28"/>
               </w:rPr>
-              <w:t>Готовить, подготавливать</w:t>
+              <w:t>Изменять, менять</w:t>
             </w:r>
           </w:p>
         </w:tc>
@@ -507,7 +487,7 @@
                 <w:rFonts w:ascii="Candara" w:hAnsi="Candara"/>
                 <w:sz w:val="28"/>
               </w:rPr>
-              <w:t>to begin, to start</w:t>
+              <w:t>senseless, pointless, meaningless</w:t>
               <w:br/>
             </w:r>
             <w:r>
@@ -515,7 +495,7 @@
                 <w:rFonts w:ascii="Candara" w:hAnsi="Candara"/>
                 <w:sz w:val="28"/>
               </w:rPr>
-              <w:t>Der Unterricht fängt um acht Uhr an.</w:t>
+              <w:t>Das ist völlig sinnlos.</w:t>
               <w:br/>
             </w:r>
             <w:r>
@@ -523,838 +503,11 @@
                 <w:rFonts w:ascii="Candara" w:hAnsi="Candara"/>
                 <w:sz w:val="28"/>
               </w:rPr>
-              <w:t>Начинать, начинаться</w:t>
+              <w:t>Бессмысленный, бесполезный</w:t>
             </w:r>
           </w:p>
         </w:tc>
       </w:tr>
-      <w:tr>
-        <w:trPr>
-          <w:trHeight w:val="4176" w:hRule="atLeast"/>
-        </w:trPr>
-        <w:tc>
-          <w:tcPr>
-            <w:tcW w:type="dxa" w:w="5947"/>
-            <w:vAlign w:val="center"/>
-            <w:tcMar>
-              <w:top w:w="0" w:type="dxa"/>
-              <w:left w:w="400" w:type="dxa"/>
-              <w:bottom w:w="0" w:type="dxa"/>
-              <w:right w:w="0" w:type="dxa"/>
-            </w:tcMar>
-          </w:tcPr>
-          <w:p>
-            <w:pPr>
-              <w:spacing w:before="0" w:after="0" w:line="240" w:lineRule="auto"/>
-              <w:jc w:val="left"/>
-            </w:pPr>
-            <w:r>
-              <w:rPr>
-                <w:rFonts w:ascii="Candara" w:hAnsi="Candara"/>
-                <w:sz w:val="28"/>
-              </w:rPr>
-              <w:t>to turn on, to switch on</w:t>
-              <w:br/>
-            </w:r>
-            <w:r>
-              <w:rPr>
-                <w:rFonts w:ascii="Candara" w:hAnsi="Candara"/>
-                <w:sz w:val="28"/>
-              </w:rPr>
-              <w:t>Mach bitte das Licht an.</w:t>
-              <w:br/>
-            </w:r>
-            <w:r>
-              <w:rPr>
-                <w:rFonts w:ascii="Candara" w:hAnsi="Candara"/>
-                <w:sz w:val="28"/>
-              </w:rPr>
-              <w:t>Включать</w:t>
-            </w:r>
-          </w:p>
-        </w:tc>
-        <w:tc>
-          <w:tcPr>
-            <w:tcW w:type="dxa" w:w="5947"/>
-            <w:vAlign w:val="center"/>
-            <w:tcMar>
-              <w:top w:w="0" w:type="dxa"/>
-              <w:left w:w="400" w:type="dxa"/>
-              <w:bottom w:w="0" w:type="dxa"/>
-              <w:right w:w="0" w:type="dxa"/>
-            </w:tcMar>
-          </w:tcPr>
-          <w:p>
-            <w:pPr>
-              <w:spacing w:before="0" w:after="0" w:line="240" w:lineRule="auto"/>
-              <w:jc w:val="left"/>
-            </w:pPr>
-            <w:r>
-              <w:rPr>
-                <w:rFonts w:ascii="Candara" w:hAnsi="Candara"/>
-                <w:sz w:val="28"/>
-              </w:rPr>
-              <w:t>to wash up, to wash the dishes</w:t>
-              <w:br/>
-            </w:r>
-            <w:r>
-              <w:rPr>
-                <w:rFonts w:ascii="Candara" w:hAnsi="Candara"/>
-                <w:sz w:val="28"/>
-              </w:rPr>
-              <w:t>Ich muss nach dem Essen abwaschen.</w:t>
-              <w:br/>
-            </w:r>
-            <w:r>
-              <w:rPr>
-                <w:rFonts w:ascii="Candara" w:hAnsi="Candara"/>
-                <w:sz w:val="28"/>
-              </w:rPr>
-              <w:t>Мыть посуду</w:t>
-            </w:r>
-          </w:p>
-        </w:tc>
-      </w:tr>
-    </w:tbl>
-    <w:tbl>
-      <w:tblPr>
-        <w:tblW w:type="auto" w:w="0"/>
-        <w:tblLayout w:type="fixed"/>
-        <w:tblLook w:firstColumn="1" w:firstRow="1" w:lastColumn="0" w:lastRow="0" w:noHBand="0" w:noVBand="1" w:val="04A0"/>
-        <w:tblBorders>
-          <w:top w:val="single" w:sz="8" w:space="0"/>
-          <w:left w:val="single" w:sz="8" w:space="0"/>
-          <w:bottom w:val="single" w:sz="8" w:space="0"/>
-          <w:right w:val="single" w:sz="8" w:space="0"/>
-          <w:insideH w:val="single" w:sz="8" w:space="0"/>
-          <w:insideV w:val="single" w:sz="8" w:space="0"/>
-        </w:tblBorders>
-      </w:tblPr>
-      <w:tblGrid>
-        <w:gridCol w:w="4513"/>
-        <w:gridCol w:w="4513"/>
-      </w:tblGrid>
-      <w:tr>
-        <w:trPr>
-          <w:trHeight w:val="4176" w:hRule="atLeast"/>
-        </w:trPr>
-        <w:tc>
-          <w:tcPr>
-            <w:tcW w:type="dxa" w:w="5947"/>
-            <w:vAlign w:val="center"/>
-            <w:tcMar>
-              <w:top w:w="0" w:type="dxa"/>
-              <w:left w:w="0" w:type="dxa"/>
-              <w:bottom w:w="0" w:type="dxa"/>
-              <w:right w:w="0" w:type="dxa"/>
-            </w:tcMar>
-          </w:tcPr>
-          <w:p>
-            <w:pPr>
-              <w:spacing w:before="0" w:after="0" w:line="240" w:lineRule="auto"/>
-              <w:jc w:val="center"/>
-            </w:pPr>
-            <w:r>
-              <w:rPr>
-                <w:rFonts w:ascii="Candara" w:hAnsi="Candara"/>
-                <w:b/>
-                <w:sz w:val="56"/>
-              </w:rPr>
-              <w:t>aufräumen</w:t>
-            </w:r>
-          </w:p>
-        </w:tc>
-        <w:tc>
-          <w:tcPr>
-            <w:tcW w:type="dxa" w:w="5947"/>
-            <w:vAlign w:val="center"/>
-            <w:tcMar>
-              <w:top w:w="0" w:type="dxa"/>
-              <w:left w:w="0" w:type="dxa"/>
-              <w:bottom w:w="0" w:type="dxa"/>
-              <w:right w:w="0" w:type="dxa"/>
-            </w:tcMar>
-          </w:tcPr>
-          <w:p>
-            <w:pPr>
-              <w:spacing w:before="0" w:after="0" w:line="240" w:lineRule="auto"/>
-              <w:jc w:val="center"/>
-            </w:pPr>
-            <w:r>
-              <w:rPr>
-                <w:rFonts w:ascii="Candara" w:hAnsi="Candara"/>
-                <w:b/>
-                <w:sz w:val="56"/>
-              </w:rPr>
-              <w:t>anrufen</w:t>
-            </w:r>
-          </w:p>
-        </w:tc>
-      </w:tr>
-      <w:tr>
-        <w:trPr>
-          <w:trHeight w:val="4176" w:hRule="atLeast"/>
-        </w:trPr>
-        <w:tc>
-          <w:tcPr>
-            <w:tcW w:type="dxa" w:w="5947"/>
-            <w:vAlign w:val="center"/>
-            <w:tcMar>
-              <w:top w:w="0" w:type="dxa"/>
-              <w:left w:w="0" w:type="dxa"/>
-              <w:bottom w:w="0" w:type="dxa"/>
-              <w:right w:w="0" w:type="dxa"/>
-            </w:tcMar>
-          </w:tcPr>
-          <w:p>
-            <w:pPr>
-              <w:spacing w:before="0" w:after="0" w:line="240" w:lineRule="auto"/>
-              <w:jc w:val="center"/>
-            </w:pPr>
-            <w:r>
-              <w:rPr>
-                <w:rFonts w:ascii="Candara" w:hAnsi="Candara"/>
-                <w:b/>
-                <w:sz w:val="56"/>
-              </w:rPr>
-              <w:t>aufhängen</w:t>
-            </w:r>
-          </w:p>
-        </w:tc>
-        <w:tc>
-          <w:tcPr>
-            <w:tcW w:type="dxa" w:w="5947"/>
-            <w:vAlign w:val="center"/>
-            <w:tcMar>
-              <w:top w:w="0" w:type="dxa"/>
-              <w:left w:w="0" w:type="dxa"/>
-              <w:bottom w:w="0" w:type="dxa"/>
-              <w:right w:w="0" w:type="dxa"/>
-            </w:tcMar>
-          </w:tcPr>
-          <w:p>
-            <w:pPr>
-              <w:spacing w:before="0" w:after="0" w:line="240" w:lineRule="auto"/>
-              <w:jc w:val="center"/>
-            </w:pPr>
-            <w:r>
-              <w:rPr>
-                <w:rFonts w:ascii="Candara" w:hAnsi="Candara"/>
-                <w:b/>
-                <w:sz w:val="56"/>
-              </w:rPr>
-              <w:t>ausleeren</w:t>
-            </w:r>
-          </w:p>
-        </w:tc>
-      </w:tr>
-      <w:tr>
-        <w:trPr>
-          <w:trHeight w:val="4176" w:hRule="atLeast"/>
-        </w:trPr>
-        <w:tc>
-          <w:tcPr>
-            <w:tcW w:type="dxa" w:w="5947"/>
-            <w:vAlign w:val="center"/>
-            <w:tcMar>
-              <w:top w:w="0" w:type="dxa"/>
-              <w:left w:w="0" w:type="dxa"/>
-              <w:bottom w:w="0" w:type="dxa"/>
-              <w:right w:w="0" w:type="dxa"/>
-            </w:tcMar>
-          </w:tcPr>
-          <w:p>
-            <w:pPr>
-              <w:spacing w:before="0" w:after="0" w:line="240" w:lineRule="auto"/>
-              <w:jc w:val="center"/>
-            </w:pPr>
-            <w:r>
-              <w:rPr>
-                <w:rFonts w:ascii="Candara" w:hAnsi="Candara"/>
-                <w:b/>
-                <w:sz w:val="56"/>
-              </w:rPr>
-              <w:t>danach</w:t>
-            </w:r>
-          </w:p>
-        </w:tc>
-        <w:tc>
-          <w:tcPr>
-            <w:tcW w:type="dxa" w:w="5947"/>
-            <w:vAlign w:val="center"/>
-            <w:tcMar>
-              <w:top w:w="0" w:type="dxa"/>
-              <w:left w:w="0" w:type="dxa"/>
-              <w:bottom w:w="0" w:type="dxa"/>
-              <w:right w:w="0" w:type="dxa"/>
-            </w:tcMar>
-          </w:tcPr>
-          <w:p>
-            <w:pPr>
-              <w:spacing w:before="0" w:after="0" w:line="240" w:lineRule="auto"/>
-              <w:jc w:val="center"/>
-            </w:pPr>
-            <w:r>
-              <w:rPr>
-                <w:rFonts w:ascii="Candara" w:hAnsi="Candara"/>
-                <w:b/>
-                <w:sz w:val="56"/>
-              </w:rPr>
-              <w:t>Geschirr</w:t>
-            </w:r>
-          </w:p>
-        </w:tc>
-      </w:tr>
-      <w:tr>
-        <w:trPr>
-          <w:trHeight w:val="4176" w:hRule="atLeast"/>
-        </w:trPr>
-        <w:tc>
-          <w:tcPr>
-            <w:tcW w:type="dxa" w:w="5947"/>
-            <w:vAlign w:val="center"/>
-            <w:tcMar>
-              <w:top w:w="0" w:type="dxa"/>
-              <w:left w:w="0" w:type="dxa"/>
-              <w:bottom w:w="0" w:type="dxa"/>
-              <w:right w:w="0" w:type="dxa"/>
-            </w:tcMar>
-          </w:tcPr>
-          <w:p>
-            <w:pPr>
-              <w:spacing w:before="0" w:after="0" w:line="240" w:lineRule="auto"/>
-              <w:jc w:val="center"/>
-            </w:pPr>
-            <w:r>
-              <w:rPr>
-                <w:rFonts w:ascii="Candara" w:hAnsi="Candara"/>
-                <w:b/>
-                <w:sz w:val="56"/>
-              </w:rPr>
-              <w:t>Bügel</w:t>
-            </w:r>
-          </w:p>
-        </w:tc>
-        <w:tc>
-          <w:tcPr>
-            <w:tcW w:type="dxa" w:w="5947"/>
-            <w:vAlign w:val="center"/>
-            <w:tcMar>
-              <w:top w:w="0" w:type="dxa"/>
-              <w:left w:w="0" w:type="dxa"/>
-              <w:bottom w:w="0" w:type="dxa"/>
-              <w:right w:w="0" w:type="dxa"/>
-            </w:tcMar>
-          </w:tcPr>
-          <w:p>
-            <w:pPr>
-              <w:spacing w:before="0" w:after="0" w:line="240" w:lineRule="auto"/>
-              <w:jc w:val="center"/>
-            </w:pPr>
-            <w:r>
-              <w:rPr>
-                <w:rFonts w:ascii="Candara" w:hAnsi="Candara"/>
-                <w:b/>
-                <w:sz w:val="56"/>
-              </w:rPr>
-              <w:t>Mülleimer</w:t>
-            </w:r>
-          </w:p>
-        </w:tc>
-      </w:tr>
-    </w:tbl>
-    <w:tbl>
-      <w:tblPr>
-        <w:tblW w:type="auto" w:w="0"/>
-        <w:tblLayout w:type="fixed"/>
-        <w:tblLook w:firstColumn="1" w:firstRow="1" w:lastColumn="0" w:lastRow="0" w:noHBand="0" w:noVBand="1" w:val="04A0"/>
-        <w:tblBorders>
-          <w:top w:val="single" w:sz="8" w:space="0"/>
-          <w:left w:val="single" w:sz="8" w:space="0"/>
-          <w:bottom w:val="single" w:sz="8" w:space="0"/>
-          <w:right w:val="single" w:sz="8" w:space="0"/>
-          <w:insideH w:val="single" w:sz="8" w:space="0"/>
-          <w:insideV w:val="single" w:sz="8" w:space="0"/>
-        </w:tblBorders>
-      </w:tblPr>
-      <w:tblGrid>
-        <w:gridCol w:w="4513"/>
-        <w:gridCol w:w="4513"/>
-      </w:tblGrid>
-      <w:tr>
-        <w:trPr>
-          <w:trHeight w:val="4176" w:hRule="atLeast"/>
-        </w:trPr>
-        <w:tc>
-          <w:tcPr>
-            <w:tcW w:type="dxa" w:w="5947"/>
-            <w:vAlign w:val="center"/>
-            <w:tcMar>
-              <w:top w:w="0" w:type="dxa"/>
-              <w:left w:w="400" w:type="dxa"/>
-              <w:bottom w:w="0" w:type="dxa"/>
-              <w:right w:w="0" w:type="dxa"/>
-            </w:tcMar>
-          </w:tcPr>
-          <w:p>
-            <w:pPr>
-              <w:spacing w:before="0" w:after="0" w:line="240" w:lineRule="auto"/>
-              <w:jc w:val="left"/>
-            </w:pPr>
-            <w:r>
-              <w:rPr>
-                <w:rFonts w:ascii="Candara" w:hAnsi="Candara"/>
-                <w:sz w:val="28"/>
-              </w:rPr>
-              <w:t>to call, to phone</w:t>
-              <w:br/>
-            </w:r>
-            <w:r>
-              <w:rPr>
-                <w:rFonts w:ascii="Candara" w:hAnsi="Candara"/>
-                <w:sz w:val="28"/>
-              </w:rPr>
-              <w:t>Ich rufe meine Mutter an.</w:t>
-              <w:br/>
-            </w:r>
-            <w:r>
-              <w:rPr>
-                <w:rFonts w:ascii="Candara" w:hAnsi="Candara"/>
-                <w:sz w:val="28"/>
-              </w:rPr>
-              <w:t>Звонить</w:t>
-            </w:r>
-          </w:p>
-        </w:tc>
-        <w:tc>
-          <w:tcPr>
-            <w:tcW w:type="dxa" w:w="5947"/>
-            <w:vAlign w:val="center"/>
-            <w:tcMar>
-              <w:top w:w="0" w:type="dxa"/>
-              <w:left w:w="400" w:type="dxa"/>
-              <w:bottom w:w="0" w:type="dxa"/>
-              <w:right w:w="0" w:type="dxa"/>
-            </w:tcMar>
-          </w:tcPr>
-          <w:p>
-            <w:pPr>
-              <w:spacing w:before="0" w:after="0" w:line="240" w:lineRule="auto"/>
-              <w:jc w:val="left"/>
-            </w:pPr>
-            <w:r>
-              <w:rPr>
-                <w:rFonts w:ascii="Candara" w:hAnsi="Candara"/>
-                <w:sz w:val="28"/>
-              </w:rPr>
-              <w:t>to tidy up, to clean up</w:t>
-              <w:br/>
-            </w:r>
-            <w:r>
-              <w:rPr>
-                <w:rFonts w:ascii="Candara" w:hAnsi="Candara"/>
-                <w:sz w:val="28"/>
-              </w:rPr>
-              <w:t>Ich muss mein Zimmer aufräumen.</w:t>
-              <w:br/>
-            </w:r>
-            <w:r>
-              <w:rPr>
-                <w:rFonts w:ascii="Candara" w:hAnsi="Candara"/>
-                <w:sz w:val="28"/>
-              </w:rPr>
-              <w:t>Убирать, наводить порядок</w:t>
-            </w:r>
-          </w:p>
-        </w:tc>
-      </w:tr>
-      <w:tr>
-        <w:trPr>
-          <w:trHeight w:val="4176" w:hRule="atLeast"/>
-        </w:trPr>
-        <w:tc>
-          <w:tcPr>
-            <w:tcW w:type="dxa" w:w="5947"/>
-            <w:vAlign w:val="center"/>
-            <w:tcMar>
-              <w:top w:w="0" w:type="dxa"/>
-              <w:left w:w="400" w:type="dxa"/>
-              <w:bottom w:w="0" w:type="dxa"/>
-              <w:right w:w="0" w:type="dxa"/>
-            </w:tcMar>
-          </w:tcPr>
-          <w:p>
-            <w:pPr>
-              <w:spacing w:before="0" w:after="0" w:line="240" w:lineRule="auto"/>
-              <w:jc w:val="left"/>
-            </w:pPr>
-            <w:r>
-              <w:rPr>
-                <w:rFonts w:ascii="Candara" w:hAnsi="Candara"/>
-                <w:sz w:val="28"/>
-              </w:rPr>
-              <w:t>to empty, to empty out</w:t>
-              <w:br/>
-            </w:r>
-            <w:r>
-              <w:rPr>
-                <w:rFonts w:ascii="Candara" w:hAnsi="Candara"/>
-                <w:sz w:val="28"/>
-              </w:rPr>
-              <w:t>Ich leere den Mülleimer aus.</w:t>
-              <w:br/>
-            </w:r>
-            <w:r>
-              <w:rPr>
-                <w:rFonts w:ascii="Candara" w:hAnsi="Candara"/>
-                <w:sz w:val="28"/>
-              </w:rPr>
-              <w:t>Опустошать, высыпать, выливать</w:t>
-            </w:r>
-          </w:p>
-        </w:tc>
-        <w:tc>
-          <w:tcPr>
-            <w:tcW w:type="dxa" w:w="5947"/>
-            <w:vAlign w:val="center"/>
-            <w:tcMar>
-              <w:top w:w="0" w:type="dxa"/>
-              <w:left w:w="400" w:type="dxa"/>
-              <w:bottom w:w="0" w:type="dxa"/>
-              <w:right w:w="0" w:type="dxa"/>
-            </w:tcMar>
-          </w:tcPr>
-          <w:p>
-            <w:pPr>
-              <w:spacing w:before="0" w:after="0" w:line="240" w:lineRule="auto"/>
-              <w:jc w:val="left"/>
-            </w:pPr>
-            <w:r>
-              <w:rPr>
-                <w:rFonts w:ascii="Candara" w:hAnsi="Candara"/>
-                <w:sz w:val="28"/>
-              </w:rPr>
-              <w:t>to hang up, to hang something</w:t>
-              <w:br/>
-            </w:r>
-            <w:r>
-              <w:rPr>
-                <w:rFonts w:ascii="Candara" w:hAnsi="Candara"/>
-                <w:sz w:val="28"/>
-              </w:rPr>
-              <w:t>Ich hänge die Jacke auf.</w:t>
-              <w:br/>
-            </w:r>
-            <w:r>
-              <w:rPr>
-                <w:rFonts w:ascii="Candara" w:hAnsi="Candara"/>
-                <w:sz w:val="28"/>
-              </w:rPr>
-              <w:t>Вешать, подвешивать</w:t>
-            </w:r>
-          </w:p>
-        </w:tc>
-      </w:tr>
-      <w:tr>
-        <w:trPr>
-          <w:trHeight w:val="4176" w:hRule="atLeast"/>
-        </w:trPr>
-        <w:tc>
-          <w:tcPr>
-            <w:tcW w:type="dxa" w:w="5947"/>
-            <w:vAlign w:val="center"/>
-            <w:tcMar>
-              <w:top w:w="0" w:type="dxa"/>
-              <w:left w:w="400" w:type="dxa"/>
-              <w:bottom w:w="0" w:type="dxa"/>
-              <w:right w:w="0" w:type="dxa"/>
-            </w:tcMar>
-          </w:tcPr>
-          <w:p>
-            <w:pPr>
-              <w:spacing w:before="0" w:after="0" w:line="240" w:lineRule="auto"/>
-              <w:jc w:val="left"/>
-            </w:pPr>
-            <w:r>
-              <w:rPr>
-                <w:rFonts w:ascii="Candara" w:hAnsi="Candara"/>
-                <w:sz w:val="28"/>
-              </w:rPr>
-              <w:t>N (das Geschirr) – dishes, crockery, tableware</w:t>
-              <w:br/>
-            </w:r>
-            <w:r>
-              <w:rPr>
-                <w:rFonts w:ascii="Candara" w:hAnsi="Candara"/>
-                <w:sz w:val="28"/>
-              </w:rPr>
-              <w:t>Das Geschirr steht in der Küche.</w:t>
-              <w:br/>
-            </w:r>
-            <w:r>
-              <w:rPr>
-                <w:rFonts w:ascii="Candara" w:hAnsi="Candara"/>
-                <w:sz w:val="28"/>
-              </w:rPr>
-              <w:t>Посуда</w:t>
-            </w:r>
-          </w:p>
-        </w:tc>
-        <w:tc>
-          <w:tcPr>
-            <w:tcW w:type="dxa" w:w="5947"/>
-            <w:vAlign w:val="center"/>
-            <w:tcMar>
-              <w:top w:w="0" w:type="dxa"/>
-              <w:left w:w="400" w:type="dxa"/>
-              <w:bottom w:w="0" w:type="dxa"/>
-              <w:right w:w="0" w:type="dxa"/>
-            </w:tcMar>
-          </w:tcPr>
-          <w:p>
-            <w:pPr>
-              <w:spacing w:before="0" w:after="0" w:line="240" w:lineRule="auto"/>
-              <w:jc w:val="left"/>
-            </w:pPr>
-            <w:r>
-              <w:rPr>
-                <w:rFonts w:ascii="Candara" w:hAnsi="Candara"/>
-                <w:sz w:val="28"/>
-              </w:rPr>
-              <w:t>after that, afterwards</w:t>
-              <w:br/>
-            </w:r>
-            <w:r>
-              <w:rPr>
-                <w:rFonts w:ascii="Candara" w:hAnsi="Candara"/>
-                <w:sz w:val="28"/>
-              </w:rPr>
-              <w:t>Danach gehe ich nach Hause.</w:t>
-              <w:br/>
-            </w:r>
-            <w:r>
-              <w:rPr>
-                <w:rFonts w:ascii="Candara" w:hAnsi="Candara"/>
-                <w:sz w:val="28"/>
-              </w:rPr>
-              <w:t>После этого, затем</w:t>
-            </w:r>
-          </w:p>
-        </w:tc>
-      </w:tr>
-      <w:tr>
-        <w:trPr>
-          <w:trHeight w:val="4176" w:hRule="atLeast"/>
-        </w:trPr>
-        <w:tc>
-          <w:tcPr>
-            <w:tcW w:type="dxa" w:w="5947"/>
-            <w:vAlign w:val="center"/>
-            <w:tcMar>
-              <w:top w:w="0" w:type="dxa"/>
-              <w:left w:w="400" w:type="dxa"/>
-              <w:bottom w:w="0" w:type="dxa"/>
-              <w:right w:w="0" w:type="dxa"/>
-            </w:tcMar>
-          </w:tcPr>
-          <w:p>
-            <w:pPr>
-              <w:spacing w:before="0" w:after="0" w:line="240" w:lineRule="auto"/>
-              <w:jc w:val="left"/>
-            </w:pPr>
-            <w:r>
-              <w:rPr>
-                <w:rFonts w:ascii="Candara" w:hAnsi="Candara"/>
-                <w:sz w:val="28"/>
-              </w:rPr>
-              <w:t>M (der Mülleimer) – rubbish bin, trash can</w:t>
-              <w:br/>
-            </w:r>
-            <w:r>
-              <w:rPr>
-                <w:rFonts w:ascii="Candara" w:hAnsi="Candara"/>
-                <w:sz w:val="28"/>
-              </w:rPr>
-              <w:t>Der Mülleimer ist voll.</w:t>
-              <w:br/>
-            </w:r>
-            <w:r>
-              <w:rPr>
-                <w:rFonts w:ascii="Candara" w:hAnsi="Candara"/>
-                <w:sz w:val="28"/>
-              </w:rPr>
-              <w:t>Мусорное ведро</w:t>
-            </w:r>
-          </w:p>
-        </w:tc>
-        <w:tc>
-          <w:tcPr>
-            <w:tcW w:type="dxa" w:w="5947"/>
-            <w:vAlign w:val="center"/>
-            <w:tcMar>
-              <w:top w:w="0" w:type="dxa"/>
-              <w:left w:w="400" w:type="dxa"/>
-              <w:bottom w:w="0" w:type="dxa"/>
-              <w:right w:w="0" w:type="dxa"/>
-            </w:tcMar>
-          </w:tcPr>
-          <w:p>
-            <w:pPr>
-              <w:spacing w:before="0" w:after="0" w:line="240" w:lineRule="auto"/>
-              <w:jc w:val="left"/>
-            </w:pPr>
-            <w:r>
-              <w:rPr>
-                <w:rFonts w:ascii="Candara" w:hAnsi="Candara"/>
-                <w:sz w:val="28"/>
-              </w:rPr>
-              <w:t>M (der Bügel) – hanger; handle, bow (depending on context)</w:t>
-              <w:br/>
-            </w:r>
-            <w:r>
-              <w:rPr>
-                <w:rFonts w:ascii="Candara" w:hAnsi="Candara"/>
-                <w:sz w:val="28"/>
-              </w:rPr>
-              <w:t>Ich hänge das Hemd auf einen Bügel.</w:t>
-              <w:br/>
-            </w:r>
-            <w:r>
-              <w:rPr>
-                <w:rFonts w:ascii="Candara" w:hAnsi="Candara"/>
-                <w:sz w:val="28"/>
-              </w:rPr>
-              <w:t>Вешалка; дужка, ручка</w:t>
-            </w:r>
-          </w:p>
-        </w:tc>
-      </w:tr>
-    </w:tbl>
-    <w:tbl>
-      <w:tblPr>
-        <w:tblW w:type="auto" w:w="0"/>
-        <w:tblLayout w:type="fixed"/>
-        <w:tblLook w:firstColumn="1" w:firstRow="1" w:lastColumn="0" w:lastRow="0" w:noHBand="0" w:noVBand="1" w:val="04A0"/>
-        <w:tblBorders>
-          <w:top w:val="single" w:sz="8" w:space="0"/>
-          <w:left w:val="single" w:sz="8" w:space="0"/>
-          <w:bottom w:val="single" w:sz="8" w:space="0"/>
-          <w:right w:val="single" w:sz="8" w:space="0"/>
-          <w:insideH w:val="single" w:sz="8" w:space="0"/>
-          <w:insideV w:val="single" w:sz="8" w:space="0"/>
-        </w:tblBorders>
-      </w:tblPr>
-      <w:tblGrid>
-        <w:gridCol w:w="4513"/>
-        <w:gridCol w:w="4513"/>
-      </w:tblGrid>
-      <w:tr>
-        <w:trPr>
-          <w:trHeight w:val="4176" w:hRule="atLeast"/>
-        </w:trPr>
-        <w:tc>
-          <w:tcPr>
-            <w:tcW w:type="dxa" w:w="5947"/>
-            <w:vAlign w:val="center"/>
-            <w:tcMar>
-              <w:top w:w="0" w:type="dxa"/>
-              <w:left w:w="0" w:type="dxa"/>
-              <w:bottom w:w="0" w:type="dxa"/>
-              <w:right w:w="0" w:type="dxa"/>
-            </w:tcMar>
-          </w:tcPr>
-          <w:p>
-            <w:pPr>
-              <w:spacing w:before="0" w:after="0" w:line="240" w:lineRule="auto"/>
-              <w:jc w:val="center"/>
-            </w:pPr>
-            <w:r>
-              <w:rPr>
-                <w:rFonts w:ascii="Candara" w:hAnsi="Candara"/>
-                <w:b/>
-                <w:sz w:val="56"/>
-              </w:rPr>
-              <w:t>Beruf</w:t>
-            </w:r>
-          </w:p>
-        </w:tc>
-        <w:tc>
-          <w:tcPr>
-            <w:tcW w:type="dxa" w:w="5947"/>
-          </w:tcPr>
-          <w:p/>
-        </w:tc>
-      </w:tr>
-      <w:tr>
-        <w:trPr>
-          <w:trHeight w:val="4176" w:hRule="atLeast"/>
-        </w:trPr>
-        <w:tc>
-          <w:tcPr>
-            <w:tcW w:type="dxa" w:w="5947"/>
-          </w:tcPr>
-          <w:p/>
-        </w:tc>
-        <w:tc>
-          <w:tcPr>
-            <w:tcW w:type="dxa" w:w="5947"/>
-          </w:tcPr>
-          <w:p/>
-        </w:tc>
-      </w:tr>
-      <w:tr>
-        <w:trPr>
-          <w:trHeight w:val="4176" w:hRule="atLeast"/>
-        </w:trPr>
-        <w:tc>
-          <w:tcPr>
-            <w:tcW w:type="dxa" w:w="5947"/>
-          </w:tcPr>
-          <w:p/>
-        </w:tc>
-        <w:tc>
-          <w:tcPr>
-            <w:tcW w:type="dxa" w:w="5947"/>
-          </w:tcPr>
-          <w:p/>
-        </w:tc>
-      </w:tr>
-      <w:tr>
-        <w:trPr>
-          <w:trHeight w:val="4176" w:hRule="atLeast"/>
-        </w:trPr>
-        <w:tc>
-          <w:tcPr>
-            <w:tcW w:type="dxa" w:w="5947"/>
-          </w:tcPr>
-          <w:p/>
-        </w:tc>
-        <w:tc>
-          <w:tcPr>
-            <w:tcW w:type="dxa" w:w="5947"/>
-          </w:tcPr>
-          <w:p/>
-        </w:tc>
-      </w:tr>
-    </w:tbl>
-    <w:tbl>
-      <w:tblPr>
-        <w:tblW w:type="auto" w:w="0"/>
-        <w:tblLayout w:type="fixed"/>
-        <w:tblLook w:firstColumn="1" w:firstRow="1" w:lastColumn="0" w:lastRow="0" w:noHBand="0" w:noVBand="1" w:val="04A0"/>
-        <w:tblBorders>
-          <w:top w:val="single" w:sz="8" w:space="0"/>
-          <w:left w:val="single" w:sz="8" w:space="0"/>
-          <w:bottom w:val="single" w:sz="8" w:space="0"/>
-          <w:right w:val="single" w:sz="8" w:space="0"/>
-          <w:insideH w:val="single" w:sz="8" w:space="0"/>
-          <w:insideV w:val="single" w:sz="8" w:space="0"/>
-        </w:tblBorders>
-      </w:tblPr>
-      <w:tblGrid>
-        <w:gridCol w:w="4513"/>
-        <w:gridCol w:w="4513"/>
-      </w:tblGrid>
       <w:tr>
         <w:trPr>
           <w:trHeight w:val="4176" w:hRule="atLeast"/>
@@ -1386,7 +539,7 @@
                 <w:rFonts w:ascii="Candara" w:hAnsi="Candara"/>
                 <w:sz w:val="28"/>
               </w:rPr>
-              <w:t>M (der Beruf) – profession, occupation, job</w:t>
+              <w:t>N (das Gesetz) – law, legislation, rule</w:t>
               <w:br/>
             </w:r>
             <w:r>
@@ -1394,7 +547,7 @@
                 <w:rFonts w:ascii="Candara" w:hAnsi="Candara"/>
                 <w:sz w:val="28"/>
               </w:rPr>
-              <w:t>Was ist dein Beruf?</w:t>
+              <w:t>Dieses Gesetz ist sehr wichtig.</w:t>
               <w:br/>
             </w:r>
             <w:r>
@@ -1402,60 +555,9 @@
                 <w:rFonts w:ascii="Candara" w:hAnsi="Candara"/>
                 <w:sz w:val="28"/>
               </w:rPr>
-              <w:t>Профессия, род занятий</w:t>
+              <w:t>Закон, правило</w:t>
             </w:r>
           </w:p>
-        </w:tc>
-      </w:tr>
-      <w:tr>
-        <w:trPr>
-          <w:trHeight w:val="4176" w:hRule="atLeast"/>
-        </w:trPr>
-        <w:tc>
-          <w:tcPr>
-            <w:tcW w:type="dxa" w:w="5947"/>
-          </w:tcPr>
-          <w:p/>
-        </w:tc>
-        <w:tc>
-          <w:tcPr>
-            <w:tcW w:type="dxa" w:w="5947"/>
-          </w:tcPr>
-          <w:p/>
-        </w:tc>
-      </w:tr>
-      <w:tr>
-        <w:trPr>
-          <w:trHeight w:val="4176" w:hRule="atLeast"/>
-        </w:trPr>
-        <w:tc>
-          <w:tcPr>
-            <w:tcW w:type="dxa" w:w="5947"/>
-          </w:tcPr>
-          <w:p/>
-        </w:tc>
-        <w:tc>
-          <w:tcPr>
-            <w:tcW w:type="dxa" w:w="5947"/>
-          </w:tcPr>
-          <w:p/>
-        </w:tc>
-      </w:tr>
-      <w:tr>
-        <w:trPr>
-          <w:trHeight w:val="4176" w:hRule="atLeast"/>
-        </w:trPr>
-        <w:tc>
-          <w:tcPr>
-            <w:tcW w:type="dxa" w:w="5947"/>
-          </w:tcPr>
-          <w:p/>
-        </w:tc>
-        <w:tc>
-          <w:tcPr>
-            <w:tcW w:type="dxa" w:w="5947"/>
-          </w:tcPr>
-          <w:p/>
         </w:tc>
       </w:tr>
     </w:tbl>

</xml_diff>